<commit_message>
docs(HelixQA): correct launcher platform (all→desktop) + document the api-bank wiring gap (§107/§11.4.99)
Two accuracy fixes after the first real HelixQA-against-Herald run: (1) step-5 now reflects the launcher's actual '--platform desktop' (was stale '--platform all') with the rationale (all spreads the [desktop] CLI bank across android/androidtv/web SKIP-noise). (2) New 'API-bank wiring follow-up (known gap)' subsection makes explicit that herald-api-v1.yaml's [api] platform is a HelixQA config constant, NOT a 'helixqa run' platform (android|web|desktop|all) — so the API plane is exercised by the launcher's live 'pherald serve' boot (real HTTPS + PG + captured healthz), not by 'helixqa run' step execution. Stated so the api table row is not read as a coverage claim it does not yet meet. HTML/PDF/DOCX siblings regenerated.

Co-Authored-By: Claude Opus 4.8 <noreply@anthropic.com>
</commit_message>
<xml_diff>
--- a/docs/guides/HELIXQA_INTEGRATION.docx
+++ b/docs/guides/HELIXQA_INTEGRATION.docx
@@ -1985,7 +1985,7 @@
         <w:rPr>
           <w:rStyle w:val="VerbatimChar"/>
         </w:rPr>
-        <w:t xml:space="preserve">helixqa run --banks &lt;api,cli&gt; --platform all</w:t>
+        <w:t xml:space="preserve">helixqa run --banks &lt;cli[,api]&gt; --platform desktop</w:t>
       </w:r>
       <w:r>
         <w:t xml:space="preserve"> </w:t>
@@ -2003,7 +2003,202 @@
         <w:t xml:space="preserve">qa-results/helixqa/&lt;run-id&gt;/</w:t>
       </w:r>
       <w:r>
-        <w:t xml:space="preserve">.</w:t>
+        <w:t xml:space="preserve">. The CLI</w:t>
+      </w:r>
+      <w:r>
+        <w:t xml:space="preserve"> </w:t>
+      </w:r>
+      <w:r>
+        <w:t xml:space="preserve">bank is</w:t>
+      </w:r>
+      <w:r>
+        <w:t xml:space="preserve"> </w:t>
+      </w:r>
+      <w:r>
+        <w:rPr>
+          <w:rStyle w:val="VerbatimChar"/>
+        </w:rPr>
+        <w:t xml:space="preserve">[desktop]</w:t>
+      </w:r>
+      <w:r>
+        <w:t xml:space="preserve">; the launcher pins</w:t>
+      </w:r>
+      <w:r>
+        <w:t xml:space="preserve"> </w:t>
+      </w:r>
+      <w:r>
+        <w:rPr>
+          <w:rStyle w:val="VerbatimChar"/>
+        </w:rPr>
+        <w:t xml:space="preserve">--platform desktop</w:t>
+      </w:r>
+      <w:r>
+        <w:t xml:space="preserve"> </w:t>
+      </w:r>
+      <w:r>
+        <w:t xml:space="preserve">rather than</w:t>
+      </w:r>
+      <w:r>
+        <w:t xml:space="preserve"> </w:t>
+      </w:r>
+      <w:r>
+        <w:rPr>
+          <w:rStyle w:val="VerbatimChar"/>
+        </w:rPr>
+        <w:t xml:space="preserve">--platform all</w:t>
+      </w:r>
+      <w:r>
+        <w:t xml:space="preserve"> </w:t>
+      </w:r>
+      <w:r>
+        <w:t xml:space="preserve">because</w:t>
+      </w:r>
+      <w:r>
+        <w:t xml:space="preserve"> </w:t>
+      </w:r>
+      <w:r>
+        <w:rPr>
+          <w:rStyle w:val="VerbatimChar"/>
+        </w:rPr>
+        <w:t xml:space="preserve">all</w:t>
+      </w:r>
+      <w:r>
+        <w:t xml:space="preserve"> </w:t>
+      </w:r>
+      <w:r>
+        <w:t xml:space="preserve">spreads the desktop cases across</w:t>
+      </w:r>
+      <w:r>
+        <w:t xml:space="preserve"> </w:t>
+      </w:r>
+      <w:r>
+        <w:rPr>
+          <w:rStyle w:val="VerbatimChar"/>
+        </w:rPr>
+        <w:t xml:space="preserve">android</w:t>
+      </w:r>
+      <w:r>
+        <w:t xml:space="preserve">/</w:t>
+      </w:r>
+      <w:r>
+        <w:rPr>
+          <w:rStyle w:val="VerbatimChar"/>
+        </w:rPr>
+        <w:t xml:space="preserve">androidtv</w:t>
+      </w:r>
+      <w:r>
+        <w:t xml:space="preserve">/</w:t>
+      </w:r>
+      <w:r>
+        <w:rPr>
+          <w:rStyle w:val="VerbatimChar"/>
+        </w:rPr>
+        <w:t xml:space="preserve">web</w:t>
+      </w:r>
+      <w:r>
+        <w:t xml:space="preserve"> </w:t>
+      </w:r>
+      <w:r>
+        <w:t xml:space="preserve">targets where they SKIP as noise. (The API</w:t>
+      </w:r>
+      <w:r>
+        <w:t xml:space="preserve"> </w:t>
+      </w:r>
+      <w:r>
+        <w:t xml:space="preserve">bank's</w:t>
+      </w:r>
+      <w:r>
+        <w:t xml:space="preserve"> </w:t>
+      </w:r>
+      <w:r>
+        <w:rPr>
+          <w:rStyle w:val="VerbatimChar"/>
+        </w:rPr>
+        <w:t xml:space="preserve">[api]</w:t>
+      </w:r>
+      <w:r>
+        <w:t xml:space="preserve"> </w:t>
+      </w:r>
+      <w:r>
+        <w:t xml:space="preserve">platform is</w:t>
+      </w:r>
+      <w:r>
+        <w:t xml:space="preserve"> </w:t>
+      </w:r>
+      <w:r>
+        <w:rPr>
+          <w:b/>
+          <w:bCs/>
+        </w:rPr>
+        <w:t xml:space="preserve">not</w:t>
+      </w:r>
+      <w:r>
+        <w:t xml:space="preserve"> </w:t>
+      </w:r>
+      <w:r>
+        <w:t xml:space="preserve">one of</w:t>
+      </w:r>
+      <w:r>
+        <w:t xml:space="preserve"> </w:t>
+      </w:r>
+      <w:r>
+        <w:rPr>
+          <w:rStyle w:val="VerbatimChar"/>
+        </w:rPr>
+        <w:t xml:space="preserve">helixqa run</w:t>
+      </w:r>
+      <w:r>
+        <w:t xml:space="preserve">'s platforms —</w:t>
+      </w:r>
+      <w:r>
+        <w:t xml:space="preserve"> </w:t>
+      </w:r>
+      <w:r>
+        <w:rPr>
+          <w:rStyle w:val="VerbatimChar"/>
+        </w:rPr>
+        <w:t xml:space="preserve">android | web | desktop | all</w:t>
+      </w:r>
+      <w:r>
+        <w:t xml:space="preserve"> </w:t>
+      </w:r>
+      <w:r>
+        <w:t xml:space="preserve">— so the API plane is driven by the live</w:t>
+      </w:r>
+      <w:r>
+        <w:t xml:space="preserve"> </w:t>
+      </w:r>
+      <w:r>
+        <w:rPr>
+          <w:rStyle w:val="VerbatimChar"/>
+        </w:rPr>
+        <w:t xml:space="preserve">pherald serve</w:t>
+      </w:r>
+      <w:r>
+        <w:t xml:space="preserve"> </w:t>
+      </w:r>
+      <w:r>
+        <w:t xml:space="preserve">boot in step 4 and asserted there; see the api-bank</w:t>
+      </w:r>
+      <w:r>
+        <w:t xml:space="preserve"> </w:t>
+      </w:r>
+      <w:r>
+        <w:t xml:space="preserve">wiring follow-up under</w:t>
+      </w:r>
+      <w:r>
+        <w:t xml:space="preserve"> </w:t>
+      </w:r>
+      <w:hyperlink w:anchor="the-test-banks">
+        <w:r>
+          <w:rPr>
+            <w:rStyle w:val="Hyperlink"/>
+          </w:rPr>
+          <w:t xml:space="preserve">The test banks</w:t>
+        </w:r>
+      </w:hyperlink>
+      <w:r>
+        <w:t xml:space="preserve">.)</w:t>
       </w:r>
     </w:p>
     <w:p>
@@ -2743,6 +2938,393 @@
         </w:tc>
       </w:tr>
     </w:tbl>
+    <w:p>
+      <w:pPr>
+        <w:pStyle w:val="BodyText"/>
+      </w:pPr>
+      <w:r>
+        <w:rPr>
+          <w:b/>
+          <w:bCs/>
+        </w:rPr>
+        <w:t xml:space="preserve">API-bank wiring follow-up (known gap).</w:t>
+      </w:r>
+      <w:r>
+        <w:t xml:space="preserve"> </w:t>
+      </w:r>
+      <w:r>
+        <w:t xml:space="preserve">The</w:t>
+      </w:r>
+      <w:r>
+        <w:t xml:space="preserve"> </w:t>
+      </w:r>
+      <w:r>
+        <w:rPr>
+          <w:rStyle w:val="VerbatimChar"/>
+        </w:rPr>
+        <w:t xml:space="preserve">herald-api-v1.yaml</w:t>
+      </w:r>
+      <w:r>
+        <w:t xml:space="preserve"> </w:t>
+      </w:r>
+      <w:r>
+        <w:t xml:space="preserve">bank</w:t>
+      </w:r>
+      <w:r>
+        <w:t xml:space="preserve"> </w:t>
+      </w:r>
+      <w:r>
+        <w:t xml:space="preserve">declares</w:t>
+      </w:r>
+      <w:r>
+        <w:t xml:space="preserve"> </w:t>
+      </w:r>
+      <w:r>
+        <w:rPr>
+          <w:rStyle w:val="VerbatimChar"/>
+        </w:rPr>
+        <w:t xml:space="preserve">platforms: [api]</w:t>
+      </w:r>
+      <w:r>
+        <w:t xml:space="preserve">, but</w:t>
+      </w:r>
+      <w:r>
+        <w:t xml:space="preserve"> </w:t>
+      </w:r>
+      <w:r>
+        <w:rPr>
+          <w:rStyle w:val="VerbatimChar"/>
+        </w:rPr>
+        <w:t xml:space="preserve">helixqa run --platform</w:t>
+      </w:r>
+      <w:r>
+        <w:t xml:space="preserve"> </w:t>
+      </w:r>
+      <w:r>
+        <w:t xml:space="preserve">accepts only</w:t>
+      </w:r>
+      <w:r>
+        <w:t xml:space="preserve"> </w:t>
+      </w:r>
+      <w:r>
+        <w:rPr>
+          <w:rStyle w:val="VerbatimChar"/>
+        </w:rPr>
+        <w:t xml:space="preserve">android | web | desktop | all</w:t>
+      </w:r>
+      <w:r>
+        <w:t xml:space="preserve"> </w:t>
+      </w:r>
+      <w:r>
+        <w:t xml:space="preserve">—</w:t>
+      </w:r>
+      <w:r>
+        <w:t xml:space="preserve"> </w:t>
+      </w:r>
+      <w:r>
+        <w:rPr>
+          <w:rStyle w:val="VerbatimChar"/>
+        </w:rPr>
+        <w:t xml:space="preserve">api</w:t>
+      </w:r>
+      <w:r>
+        <w:t xml:space="preserve"> </w:t>
+      </w:r>
+      <w:r>
+        <w:t xml:space="preserve">is a HelixQA</w:t>
+      </w:r>
+      <w:r>
+        <w:t xml:space="preserve"> </w:t>
+      </w:r>
+      <w:r>
+        <w:rPr>
+          <w:i/>
+          <w:iCs/>
+        </w:rPr>
+        <w:t xml:space="preserve">config</w:t>
+      </w:r>
+      <w:r>
+        <w:t xml:space="preserve"> </w:t>
+      </w:r>
+      <w:r>
+        <w:t xml:space="preserve">platform</w:t>
+      </w:r>
+      <w:r>
+        <w:t xml:space="preserve"> </w:t>
+      </w:r>
+      <w:r>
+        <w:t xml:space="preserve">constant, not a</w:t>
+      </w:r>
+      <w:r>
+        <w:t xml:space="preserve"> </w:t>
+      </w:r>
+      <w:r>
+        <w:rPr>
+          <w:rStyle w:val="VerbatimChar"/>
+        </w:rPr>
+        <w:t xml:space="preserve">run</w:t>
+      </w:r>
+      <w:r>
+        <w:t xml:space="preserve"> </w:t>
+      </w:r>
+      <w:r>
+        <w:t xml:space="preserve">selector. As a result the bank's cases do not match</w:t>
+      </w:r>
+      <w:r>
+        <w:t xml:space="preserve"> </w:t>
+      </w:r>
+      <w:r>
+        <w:t xml:space="preserve">any</w:t>
+      </w:r>
+      <w:r>
+        <w:t xml:space="preserve"> </w:t>
+      </w:r>
+      <w:r>
+        <w:rPr>
+          <w:rStyle w:val="VerbatimChar"/>
+        </w:rPr>
+        <w:t xml:space="preserve">run</w:t>
+      </w:r>
+      <w:r>
+        <w:t xml:space="preserve"> </w:t>
+      </w:r>
+      <w:r>
+        <w:t xml:space="preserve">platform and are not driven by</w:t>
+      </w:r>
+      <w:r>
+        <w:t xml:space="preserve"> </w:t>
+      </w:r>
+      <w:r>
+        <w:rPr>
+          <w:rStyle w:val="VerbatimChar"/>
+        </w:rPr>
+        <w:t xml:space="preserve">helixqa run</w:t>
+      </w:r>
+      <w:r>
+        <w:t xml:space="preserve"> </w:t>
+      </w:r>
+      <w:r>
+        <w:t xml:space="preserve">itself. Today the</w:t>
+      </w:r>
+      <w:r>
+        <w:t xml:space="preserve"> </w:t>
+      </w:r>
+      <w:r>
+        <w:t xml:space="preserve">API surface is instead exercised directly by the launcher's step-4 live</w:t>
+      </w:r>
+      <w:r>
+        <w:t xml:space="preserve"> </w:t>
+      </w:r>
+      <w:r>
+        <w:rPr>
+          <w:rStyle w:val="VerbatimChar"/>
+        </w:rPr>
+        <w:t xml:space="preserve">pherald serve</w:t>
+      </w:r>
+      <w:r>
+        <w:t xml:space="preserve"> </w:t>
+      </w:r>
+      <w:r>
+        <w:t xml:space="preserve">boot (real HTTPS listener + real Postgres + captured</w:t>
+      </w:r>
+      <w:r>
+        <w:t xml:space="preserve"> </w:t>
+      </w:r>
+      <w:r>
+        <w:rPr>
+          <w:rStyle w:val="VerbatimChar"/>
+        </w:rPr>
+        <w:t xml:space="preserve">healthz</w:t>
+      </w:r>
+      <w:r>
+        <w:t xml:space="preserve"> </w:t>
+      </w:r>
+      <w:r>
+        <w:t xml:space="preserve">body), which is the genuine anti-bluff API evidence. Closing the</w:t>
+      </w:r>
+      <w:r>
+        <w:t xml:space="preserve"> </w:t>
+      </w:r>
+      <w:r>
+        <w:t xml:space="preserve">gap so</w:t>
+      </w:r>
+      <w:r>
+        <w:t xml:space="preserve"> </w:t>
+      </w:r>
+      <w:r>
+        <w:rPr>
+          <w:rStyle w:val="VerbatimChar"/>
+        </w:rPr>
+        <w:t xml:space="preserve">helixqa run</w:t>
+      </w:r>
+      <w:r>
+        <w:t xml:space="preserve"> </w:t>
+      </w:r>
+      <w:r>
+        <w:t xml:space="preserve">drives the</w:t>
+      </w:r>
+      <w:r>
+        <w:t xml:space="preserve"> </w:t>
+      </w:r>
+      <w:r>
+        <w:rPr>
+          <w:rStyle w:val="VerbatimChar"/>
+        </w:rPr>
+        <w:t xml:space="preserve">[api]</w:t>
+      </w:r>
+      <w:r>
+        <w:t xml:space="preserve"> </w:t>
+      </w:r>
+      <w:r>
+        <w:t xml:space="preserve">bank natively (either by teaching</w:t>
+      </w:r>
+      <w:r>
+        <w:t xml:space="preserve"> </w:t>
+      </w:r>
+      <w:r>
+        <w:rPr>
+          <w:rStyle w:val="VerbatimChar"/>
+        </w:rPr>
+        <w:t xml:space="preserve">run</w:t>
+      </w:r>
+      <w:r>
+        <w:t xml:space="preserve"> </w:t>
+      </w:r>
+      <w:r>
+        <w:t xml:space="preserve">an</w:t>
+      </w:r>
+      <w:r>
+        <w:t xml:space="preserve"> </w:t>
+      </w:r>
+      <w:r>
+        <w:rPr>
+          <w:rStyle w:val="VerbatimChar"/>
+        </w:rPr>
+        <w:t xml:space="preserve">api</w:t>
+      </w:r>
+      <w:r>
+        <w:t xml:space="preserve"> </w:t>
+      </w:r>
+      <w:r>
+        <w:t xml:space="preserve">platform that targets an HTTP base-URL, or by mapping the</w:t>
+      </w:r>
+      <w:r>
+        <w:t xml:space="preserve"> </w:t>
+      </w:r>
+      <w:r>
+        <w:t xml:space="preserve">bank onto</w:t>
+      </w:r>
+      <w:r>
+        <w:t xml:space="preserve"> </w:t>
+      </w:r>
+      <w:r>
+        <w:rPr>
+          <w:rStyle w:val="VerbatimChar"/>
+        </w:rPr>
+        <w:t xml:space="preserve">desktop</w:t>
+      </w:r>
+      <w:r>
+        <w:t xml:space="preserve"> </w:t>
+      </w:r>
+      <w:r>
+        <w:rPr>
+          <w:rStyle w:val="VerbatimChar"/>
+        </w:rPr>
+        <w:t xml:space="preserve">curl</w:t>
+      </w:r>
+      <w:r>
+        <w:t xml:space="preserve"> </w:t>
+      </w:r>
+      <w:r>
+        <w:t xml:space="preserve">steps against the live listener) is tracked as</w:t>
+      </w:r>
+      <w:r>
+        <w:t xml:space="preserve"> </w:t>
+      </w:r>
+      <w:r>
+        <w:t xml:space="preserve">the</w:t>
+      </w:r>
+      <w:r>
+        <w:t xml:space="preserve"> </w:t>
+      </w:r>
+      <w:r>
+        <w:rPr>
+          <w:b/>
+          <w:bCs/>
+        </w:rPr>
+        <w:t xml:space="preserve">api-bank wiring</w:t>
+      </w:r>
+      <w:r>
+        <w:t xml:space="preserve"> </w:t>
+      </w:r>
+      <w:r>
+        <w:t xml:space="preserve">follow-up. Until then the table's</w:t>
+      </w:r>
+      <w:r>
+        <w:t xml:space="preserve"> </w:t>
+      </w:r>
+      <w:r>
+        <w:rPr>
+          <w:rStyle w:val="VerbatimChar"/>
+        </w:rPr>
+        <w:t xml:space="preserve">api</w:t>
+      </w:r>
+      <w:r>
+        <w:t xml:space="preserve"> </w:t>
+      </w:r>
+      <w:r>
+        <w:t xml:space="preserve">row</w:t>
+      </w:r>
+      <w:r>
+        <w:t xml:space="preserve"> </w:t>
+      </w:r>
+      <w:r>
+        <w:t xml:space="preserve">documents</w:t>
+      </w:r>
+      <w:r>
+        <w:t xml:space="preserve"> </w:t>
+      </w:r>
+      <w:r>
+        <w:rPr>
+          <w:i/>
+          <w:iCs/>
+        </w:rPr>
+        <w:t xml:space="preserve">intended</w:t>
+      </w:r>
+      <w:r>
+        <w:t xml:space="preserve"> </w:t>
+      </w:r>
+      <w:r>
+        <w:t xml:space="preserve">coverage delivered via the launcher's live serve, not</w:t>
+      </w:r>
+      <w:r>
+        <w:t xml:space="preserve"> </w:t>
+      </w:r>
+      <w:r>
+        <w:t xml:space="preserve">via</w:t>
+      </w:r>
+      <w:r>
+        <w:t xml:space="preserve"> </w:t>
+      </w:r>
+      <w:r>
+        <w:rPr>
+          <w:rStyle w:val="VerbatimChar"/>
+        </w:rPr>
+        <w:t xml:space="preserve">helixqa run</w:t>
+      </w:r>
+      <w:r>
+        <w:t xml:space="preserve"> </w:t>
+      </w:r>
+      <w:r>
+        <w:t xml:space="preserve">step execution — stated explicitly here so the row is</w:t>
+      </w:r>
+      <w:r>
+        <w:t xml:space="preserve"> </w:t>
+      </w:r>
+      <w:r>
+        <w:t xml:space="preserve">not read as a coverage claim it does not yet meet (§107 anti-bluff).</w:t>
+      </w:r>
+    </w:p>
     <w:p>
       <w:pPr>
         <w:pStyle w:val="BodyText"/>

</xml_diff>